<commit_message>
fix(helm): reuse generic CCAAS packages across hosts
</commit_message>
<xml_diff>
--- a/deliverables/GUIA_HOST_REPRODUCIBLE_ES.docx
+++ b/deliverables/GUIA_HOST_REPRODUCIBLE_ES.docx
@@ -185,7 +185,7 @@
           <w:spacing w:val="0"/>
           <w:color w:val="181E2A"/>
         </w:rPr>
-        <w:t xml:space="preserve">ghcr.io/global-datacare/host-runtime@sha256:0742ce44f2c56b8a559ed872620c779adaac64c6e1b476d3fda1762f0d2fe510</w:t>
+        <w:t xml:space="preserve">ghcr.io/global-datacare/host-runtime@sha256:f5d45cebaa5e7443ebf70aac85f33794d3d366dcb5370ab7921e9bc56336c0fa</w:t>
       </w:r>
       <w:r>
         <w:rPr>
@@ -210,7 +210,7 @@
           <w:spacing w:val="0"/>
           <w:color w:val="181E2A"/>
         </w:rPr>
-        <w:t xml:space="preserve">GW CORE y CCAAS son artefactos OCI distintos. El runtime CCAAS contiene los nueve servidores de chaincode, pero los package IDs se generan para el nombre, namespace y Services exactos de cada release Helm.</w:t>
+        <w:t xml:space="preserve">GW CORE y CCAAS son artefactos OCI distintos. El runtime CCAAS contiene los diez servidores de chaincode. Todos los hosts usan gdc-cc-organization-sc:9999 dentro de su namespace aislado, por lo que los paquetes y package IDs son reutilizables.</w:t>
       </w:r>
     </w:p>
     <w:p>
@@ -827,7 +827,7 @@
           <w:spacing w:val="0"/>
           <w:color w:val="181E2A"/>
         </w:rPr>
-        <w:t xml:space="preserve">; espera el rollout; realiza operaciones E2E; comprueba canales y CouchDB; consulta PostgreSQL e IPFS dentro de los pods; instala y aprueba los nueve paquetes CCAAS en el peer Kubernetes; ejecuta Consent y SMART mediante ese peer; reinicia GW, peer y CCAAS y comprueba la recuperación. </w:t>
+        <w:t xml:space="preserve">; espera el rollout; realiza operaciones E2E; comprueba canales y CouchDB; consulta PostgreSQL e IPFS dentro de los pods; instala y aprueba los diez paquetes CCAAS en el peer Kubernetes; ejecuta Consent y SMART mediante ese peer; reinicia GW, peer y CCAAS y comprueba la recuperación. </w:t>
       </w:r>
       <w:r>
         <w:rPr>
@@ -2521,20 +2521,20 @@
           <w:spacing w:val="0"/>
           <w:color w:val="181E2A"/>
         </w:rPr>
-        <w:t xml:space="preserve">helm pull oci://ghcr.io/global-datacare/gdc-host --version 0.3.2</w:t>
-      </w:r>
-    </w:p>
-    <w:p>
-      <w:pPr/>
-      <w:r>
-        <w:rPr>
-          <w:rFonts w:ascii="Menlo" w:hAnsi="Menlo" w:cs="Menlo"/>
-          <w:sz w:val="26"/>
-          <w:sz-cs w:val="26"/>
-          <w:spacing w:val="0"/>
-          <w:color w:val="181E2A"/>
-        </w:rPr>
-        <w:t xml:space="preserve">helm show chart oci://ghcr.io/global-datacare/gdc-host --version 0.3.2</w:t>
+        <w:t xml:space="preserve">helm pull oci://ghcr.io/global-datacare/gdc-host --version 0.3.4</w:t>
+      </w:r>
+    </w:p>
+    <w:p>
+      <w:pPr/>
+      <w:r>
+        <w:rPr>
+          <w:rFonts w:ascii="Menlo" w:hAnsi="Menlo" w:cs="Menlo"/>
+          <w:sz w:val="26"/>
+          <w:sz-cs w:val="26"/>
+          <w:spacing w:val="0"/>
+          <w:color w:val="181E2A"/>
+        </w:rPr>
+        <w:t xml:space="preserve">helm show chart oci://ghcr.io/global-datacare/gdc-host --version 0.3.4</w:t>
       </w:r>
     </w:p>
     <w:p>
@@ -2549,7 +2549,7 @@
           <w:spacing w:val="0"/>
           <w:color w:val="181E2A"/>
         </w:rPr>
-        <w:t xml:space="preserve">El chart OCI es el mismo artefacto validado en local-network. Los values, Secrets, grants, MSP/TLS y package IDs se generan de nuevo para cada entorno.</w:t>
+        <w:t xml:space="preserve">El chart OCI es el mismo artefacto validado en local-network. Los values, Secrets, grants y MSP/TLS se generan de nuevo para cada entorno; los package IDs CCAAS deterministas son compartidos.</w:t>
       </w:r>
     </w:p>
     <w:p>
@@ -2575,7 +2575,7 @@
           <w:spacing w:val="0"/>
           <w:color w:val="181E2A"/>
         </w:rPr>
-        <w:t xml:space="preserve">export CCAAS_PUBLIC_IMAGE="ghcr.io/global-datacare/host-runtime@sha256:0742ce44f2c56b8a559ed872620c779adaac64c6e1b476d3fda1762f0d2fe510"</w:t>
+        <w:t xml:space="preserve">export CCAAS_PUBLIC_IMAGE="ghcr.io/global-datacare/host-runtime@sha256:f5d45cebaa5e7443ebf70aac85f33794d3d366dcb5370ab7921e9bc56336c0fa"</w:t>
       </w:r>
     </w:p>
     <w:p>
@@ -2642,7 +2642,7 @@
           <w:spacing w:val="0"/>
           <w:color w:val="181E2A"/>
         </w:rPr>
-        <w:t xml:space="preserve">GW CORE es un servicio y no se publica en npm. El values de GW usa su digest OCI. Cada entrada CCAAS usa el digest del runtime común y un paquete cuya dirección sea el Service exacto del release. El package ID es </w:t>
+        <w:t xml:space="preserve">GW CORE es un servicio y no se publica en npm. El values de GW usa su digest OCI. Cada entrada CCAAS usa el Service estable gdc-cc-&lt;contrato&gt;:9999. El package ID es </w:t>
       </w:r>
       <w:r>
         <w:rPr>
@@ -2662,33 +2662,31 @@
           <w:spacing w:val="0"/>
           <w:color w:val="181E2A"/>
         </w:rPr>
-        <w:t xml:space="preserve">; cualquier cambio de Service, release, puerto o TLS obliga a regenerarlo.</w:t>
-      </w:r>
-    </w:p>
-    <w:p>
-      <w:pPr/>
-      <w:r>
-        <w:rPr>
-          <w:rFonts w:ascii="Menlo" w:hAnsi="Menlo" w:cs="Menlo"/>
-          <w:sz w:val="26"/>
-          <w:sz-cs w:val="26"/>
-          <w:spacing w:val="0"/>
-          <w:color w:val="181E2A"/>
-        </w:rPr>
-        <w:t xml:space="preserve">HOST_FULLNAME="${HELM_RELEASE}" \</w:t>
-      </w:r>
-    </w:p>
-    <w:p>
-      <w:pPr/>
-      <w:r>
-        <w:rPr>
-          <w:rFonts w:ascii="Menlo" w:hAnsi="Menlo" w:cs="Menlo"/>
-          <w:sz w:val="26"/>
-          <w:sz-cs w:val="26"/>
-          <w:spacing w:val="0"/>
-          <w:color w:val="181E2A"/>
-        </w:rPr>
-        <w:t xml:space="preserve">KUBE_NAMESPACE="${KUBE_NAMESPACE}" \</w:t>
+        <w:t xml:space="preserve">; solo cambiar ese contrato, el puerto o TLS obliga a regenerarlo.</w:t>
+      </w:r>
+    </w:p>
+    <w:p>
+      <w:pPr/>
+      <w:r>
+        <w:rPr>
+          <w:rFonts w:ascii="Menlo" w:hAnsi="Menlo" w:cs="Menlo"/>
+          <w:sz w:val="26"/>
+          <w:sz-cs w:val="26"/>
+          <w:spacing w:val="0"/>
+          <w:color w:val="181E2A"/>
+        </w:rPr>
+      </w:r>
+    </w:p>
+    <w:p>
+      <w:pPr/>
+      <w:r>
+        <w:rPr>
+          <w:rFonts w:ascii="Menlo" w:hAnsi="Menlo" w:cs="Menlo"/>
+          <w:sz w:val="26"/>
+          <w:sz-cs w:val="26"/>
+          <w:spacing w:val="0"/>
+          <w:color w:val="181E2A"/>
+        </w:rPr>
       </w:r>
     </w:p>
     <w:p>
@@ -2755,7 +2753,7 @@
           <w:spacing w:val="0"/>
           <w:color w:val="181E2A"/>
         </w:rPr>
-        <w:t xml:space="preserve">El resultado contiene nueve archivos, sus package IDs en </w:t>
+        <w:t xml:space="preserve">El resultado contiene diez archivos, sus package IDs en </w:t>
       </w:r>
       <w:r>
         <w:rPr>
@@ -2980,20 +2978,20 @@
           <w:spacing w:val="0"/>
           <w:color w:val="181E2A"/>
         </w:rPr>
-        <w:t xml:space="preserve">helm pull oci://ghcr.io/global-datacare/gdc-host --version 0.3.2</w:t>
-      </w:r>
-    </w:p>
-    <w:p>
-      <w:pPr/>
-      <w:r>
-        <w:rPr>
-          <w:rFonts w:ascii="Menlo" w:hAnsi="Menlo" w:cs="Menlo"/>
-          <w:sz w:val="26"/>
-          <w:sz-cs w:val="26"/>
-          <w:spacing w:val="0"/>
-          <w:color w:val="181E2A"/>
-        </w:rPr>
-        <w:t xml:space="preserve">tar -xzf gdc-host-0.3.2.tgz -C /secure/onboarding</w:t>
+        <w:t xml:space="preserve">helm pull oci://ghcr.io/global-datacare/gdc-host --version 0.3.4</w:t>
+      </w:r>
+    </w:p>
+    <w:p>
+      <w:pPr/>
+      <w:r>
+        <w:rPr>
+          <w:rFonts w:ascii="Menlo" w:hAnsi="Menlo" w:cs="Menlo"/>
+          <w:sz w:val="26"/>
+          <w:sz-cs w:val="26"/>
+          <w:spacing w:val="0"/>
+          <w:color w:val="181E2A"/>
+        </w:rPr>
+        <w:t xml:space="preserve">tar -xzf gdc-host-0.3.4.tgz -C /secure/onboarding</w:t>
       </w:r>
     </w:p>
     <w:p>

</xml_diff>

<commit_message>
release: consolidate gdc-host chart 0.4.0
</commit_message>
<xml_diff>
--- a/deliverables/GUIA_HOST_REPRODUCIBLE_ES.docx
+++ b/deliverables/GUIA_HOST_REPRODUCIBLE_ES.docx
@@ -116,7 +116,7 @@
           <w:spacing w:val="0"/>
           <w:color w:val="181E2A"/>
         </w:rPr>
-        <w:t xml:space="preserve">ghcr.io/global-datacare/gw-core@sha256:e08eb3482e8e6df812269ba72c14d7831c2cdc331fe7bc6836a606b4e2e96a71</w:t>
+        <w:t xml:space="preserve">ghcr.io/global-datacare/gw-core@sha256:a9d18e92fc422f4fd79d18bfce6977814812187870f6ddda72aebc8428ae5b18</w:t>
       </w:r>
       <w:r>
         <w:rPr>
@@ -2562,7 +2562,7 @@
           <w:spacing w:val="0"/>
           <w:color w:val="181E2A"/>
         </w:rPr>
-        <w:t xml:space="preserve">export GW_PUBLIC_IMAGE="ghcr.io/global-datacare/gw-core@sha256:e08eb3482e8e6df812269ba72c14d7831c2cdc331fe7bc6836a606b4e2e96a71"</w:t>
+        <w:t xml:space="preserve">export GW_PUBLIC_IMAGE="ghcr.io/global-datacare/gw-core@sha256:a9d18e92fc422f4fd79d18bfce6977814812187870f6ddda72aebc8428ae5b18"</w:t>
       </w:r>
     </w:p>
     <w:p>

</xml_diff>